<commit_message>
docs: expand introduction with clearer AI theme, scenes and validated outcomes
</commit_message>
<xml_diff>
--- a/submission/TA_Cup_2026/finalization/02_作品介绍文档.docx
+++ b/submission/TA_Cup_2026/finalization/02_作品介绍文档.docx
@@ -68,13 +68,27 @@
       </w:r>
     </w:p>
     <w:p>
+      <w:pPr>
+        <w:keepNext/>
+      </w:pPr>
+      <w:r>
+        <w:rPr>
+          <w:rFonts w:ascii="Noto Serif CJK SC" w:hAnsi="Noto Serif CJK SC" w:eastAsia="Noto Serif CJK SC"/>
+          <w:b/>
+          <w:color w:val="000000"/>
+          <w:sz w:val="22"/>
+        </w:rPr>
+        <w:t>核心主线：AI学习助手串联需求、匹配与教学反馈，形成可解释、可追踪的教育服务闭环。</w:t>
+      </w:r>
+    </w:p>
+    <w:p>
       <w:r>
         <w:rPr>
           <w:rFonts w:ascii="Noto Serif CJK SC" w:hAnsi="Noto Serif CJK SC" w:eastAsia="Noto Serif CJK SC"/>
           <w:color w:val="000000"/>
           <w:sz w:val="21"/>
         </w:rPr>
-        <w:t>领航云学堂面向学生、家长与大学生家教，以“小书灵”AI学习助手连接找老师、学习支持、预约教学与课后反馈。家长核对需求和推荐理由后选择教师；教师接受预约后安排课程、记录课堂表现、确认反馈并修订下一课。平台将分散的信息和教学过程纳入同一条可追踪的服务链。</w:t>
+        <w:t>领航云学堂面向学生、家长与大学生家教，以“小书灵”AI学习助手连接找老师、学习支持、预约教学与课后反馈。家长核对需求和推荐理由后选择教师；教师接受预约后安排课程、记录课堂表现、确认反馈并修订下一课。平台将分散的信息和教学过程纳入同一条可追踪的服务链，让家长看清选择依据，让教师依据课堂事实安排教学。</w:t>
       </w:r>
     </w:p>
     <w:p>
@@ -252,16 +266,6 @@
     <w:p/>
     <w:p>
       <w:r>
-        <w:rPr>
-          <w:rFonts w:ascii="Noto Serif CJK SC" w:hAnsi="Noto Serif CJK SC" w:eastAsia="Noto Serif CJK SC"/>
-          <w:color w:val="000000"/>
-          <w:sz w:val="21"/>
-        </w:rPr>
-        <w:t>系统采用本机Mock与开发API双模式；模型能力按服务端配置启用。当前页面、业务状态和课程案例均可通过真实产品操作展示。</w:t>
-      </w:r>
-    </w:p>
-    <w:p>
-      <w:r>
         <w:br w:type="page"/>
       </w:r>
     </w:p>
@@ -296,7 +300,7 @@
           <w:color w:val="000000"/>
           <w:sz w:val="21"/>
         </w:rPr>
-        <w:t>家长需要比较科目、预算、时间、授课方式和服务区域，大学生家教也需要判断自己能否承接。平台将这些条件结构化展示，让双方围绕同一份需求进行选择，减少依靠零散信息反复确认的步骤。</w:t>
+        <w:t>家长需要比较科目、预算、时间、授课方式和服务区域，大学生家教也需要判断自己能否承接。平台将这些条件结构化展示，让双方围绕同一份需求进行选择，减少依靠零散信息反复确认的步骤。家长看到的不只是教师卡片，还能核对“哪些条件满足、为什么排在这里”；教师接到的不只是邀请，还能查看同一份预约中的科目与期望时间。授课后，教师观察、错题与下一课安排也容易脱节；平台把这些记录连接到反馈和课程版本，使选师与教学支持相互衔接。</w:t>
       </w:r>
     </w:p>
     <w:p>
@@ -757,7 +761,7 @@
           <w:color w:val="000000"/>
           <w:sz w:val="21"/>
         </w:rPr>
-        <w:t>教师详情集中展示学校、专业、科目、授课方式、时间、片区、简介、照片和参考费用。家长可从结果卡进入详情并提交预约；家教可接受或拒绝，家长查看真实当前状态。管理员负责入驻资料审核和举报处理。</w:t>
+        <w:t>教师详情集中展示学校、专业、科目、授课方式、时间、片区、简介、照片和参考费用，回应“能否教、何时教、费用多少、区域是否合适”等实际选择问题。家长可从结果卡进入详情并提交预约；家教可接受或拒绝，家长查看真实当前状态。管理员负责入驻资料审核和举报处理。</w:t>
       </w:r>
     </w:p>
     <w:p>
@@ -784,7 +788,7 @@
           <w:rFonts w:ascii="Noto Serif CJK SC" w:hAnsi="Noto Serif CJK SC" w:eastAsia="Noto Serif CJK SC"/>
           <w:color w:val="000000"/>
         </w:rPr>
-        <w:t>三 AI学习助手、学习资源与地图</w:t>
+        <w:t>三 落地场景一：AI学习与选师衔接</w:t>
       </w:r>
     </w:p>
     <w:p>
@@ -806,7 +810,7 @@
           <w:color w:val="000000"/>
           <w:sz w:val="21"/>
         </w:rPr>
-        <w:t>小书灵提供平台使用指引、需求整理与学习问答入口。兼容浏览器支持语音输入和中文朗读，同时保留文字操作。服务端提供模型对话与单张作业图片辅导接口，图片由用户主动选择并确认；具体生成结果依赖已配置模型，页面区分模型答复与本机演示答复。</w:t>
+        <w:t>小书灵提供平台使用指引、需求整理与学习问答入口。兼容浏览器支持语音输入和中文朗读，同时保留文字操作。服务端提供模型对话与单张作业图片辅导接口，图片由用户主动选择并确认；具体生成结果依赖已配置模型，页面区分模型答复与本机演示答复。它的作用是把“说出问题”与“进入可操作页面”衔接起来：用户既可问平台怎么使用，也可整理找老师的条件，并在确认后进入智能匹配。</w:t>
       </w:r>
     </w:p>
     <w:p>
@@ -880,7 +884,7 @@
           <w:color w:val="000000"/>
           <w:sz w:val="21"/>
         </w:rPr>
-        <w:t>学习中心提供22份原创入门笔记、66道固定示例题，支持按学段、科目和主题浏览、自测、答案解析与内容导出。配置模型后，可围绕主题生成练习草案；固定题与模型生成内容分别标注。用户也可从知识点进入对应科目的教师匹配。</w:t>
+        <w:t>学习中心提供22份原创入门笔记、66道固定示例题，支持按学段、科目和主题浏览、自测、答案解析与内容导出。配置模型后，可围绕主题生成练习草案；固定题与模型生成内容分别标注。用户也可从知识点进入对应科目的教师匹配。例如，在方程笔记中发现学习困难后，可把学科和学段带入找老师流程，使自主学习与人工辅导围绕同一学习问题继续衔接。</w:t>
       </w:r>
     </w:p>
     <w:p>
@@ -902,7 +906,7 @@
           <w:color w:val="000000"/>
           <w:sz w:val="21"/>
         </w:rPr>
-        <w:t>H5地图支持西安公共服务片区选择与参考距离筛选。订单地图区分12条固定虚构样例和当前账户预约；开发API按角色权限每10秒读取相关状态，并支持手动刷新。地图展示公共片区参考点，不公开家庭住址，也不把直线距离当作实际通勤时间。</w:t>
+        <w:t>H5地图支持西安公共服务片区选择与参考距离筛选。订单地图区分12条固定虚构样例和当前账户预约；开发API按角色权限每10秒读取相关状态，并支持手动刷新。地图展示公共片区参考点，不公开家庭住址，也不把直线距离当作实际通勤时间。家长用片区和距离辅助选择，教师结合公开服务区域判断安排；地图信息与预约状态连接，服务于实际约课决策。</w:t>
       </w:r>
     </w:p>
     <w:p>
@@ -919,7 +923,7 @@
           <w:rFonts w:ascii="Noto Serif CJK SC" w:hAnsi="Noto Serif CJK SC" w:eastAsia="Noto Serif CJK SC"/>
           <w:color w:val="000000"/>
         </w:rPr>
-        <w:t>四 课堂证据与教学反馈闭环</w:t>
+        <w:t>四 落地场景二：教学反馈闭环</w:t>
       </w:r>
     </w:p>
     <w:p>
@@ -941,7 +945,7 @@
           <w:color w:val="000000"/>
           <w:sz w:val="21"/>
         </w:rPr>
-        <w:t>已接受预约的教师可以加载课程、编辑目标与教学安排，核查题目及标准答案后发布。家长只能查看教师确认后的课程和反馈。系统中的初一数学“一元一次方程”案例包含四节课程，每节45分钟，提供教学目标、例题、练习、答案、作业和观察指标。</w:t>
+        <w:t>教学服务以一条已接受的预约为入口，把“备课—授课—反馈—下一课调整”保存在同一业务上下文。教师可以加载课程、编辑目标与教学安排，核查题目及标准答案后发布。家长只能查看教师确认后的课程和反馈。系统中的初一数学“一元一次方程”案例包含四节课程，每节45分钟，提供教学目标、例题、练习、答案、作业和观察指标。</w:t>
       </w:r>
     </w:p>
     <w:tbl>
@@ -1327,7 +1331,7 @@
           <w:color w:val="000000"/>
           <w:sz w:val="21"/>
         </w:rPr>
-        <w:t>案例根据Q4、Q5与移项符号记录，给出第三课增加10分钟符号专项的调整建议，部分内容顺延，总时长仍为45分钟。采纳建议先形成草稿，教师再次核验并发布v2后家长可见，v1继续保留。课堂事实改变时，旧建议不能继续作为新修订依据。</w:t>
+        <w:t>例如，虚构学生“小航”向“小林老师”预约初一数学辅导。第二课的Q4、Q5和教师观察共同指向移项符号问题，第三课据此增加10分钟符号专项，部分内容顺延，总时长仍为45分钟。采纳建议先形成草稿，教师再次核验并发布v2后家长可见，v1继续保留。课堂事实改变时，旧建议不能继续作为新修订依据。</w:t>
       </w:r>
     </w:p>
     <w:tbl>
@@ -1448,7 +1452,7 @@
           <w:color w:val="000000"/>
           <w:sz w:val="21"/>
         </w:rPr>
-        <w:t>课程、样例反馈与调整建议保留页面来源标识，所有教学发布均由教师确认，不把预置案例包装成实时模型生成。</w:t>
+        <w:t>这条链路让家长能看到“本次记录了什么、为什么需要巩固、下一课改变了什么”，也让教师能回看修订依据和历史版本。课程、样例反馈与建议保留来源标识，所有教学发布均由教师确认。</w:t>
       </w:r>
     </w:p>
     <w:p>
@@ -1465,7 +1469,7 @@
           <w:rFonts w:ascii="Noto Serif CJK SC" w:hAnsi="Noto Serif CJK SC" w:eastAsia="Noto Serif CJK SC"/>
           <w:color w:val="000000"/>
         </w:rPr>
-        <w:t>五 技术实现、创新价值与工程成果</w:t>
+        <w:t>五 技术创新与小团队创业实现</w:t>
       </w:r>
     </w:p>
     <w:p>
@@ -1477,7 +1481,61 @@
           <w:rFonts w:ascii="Noto Serif CJK SC" w:hAnsi="Noto Serif CJK SC" w:eastAsia="Noto Serif CJK SC"/>
           <w:color w:val="000000"/>
         </w:rPr>
-        <w:t>5.1 跨端架构与双模式运行</w:t>
+        <w:t>5.1 AI整理、规则约束、人工确认的任务链</w:t>
+      </w:r>
+    </w:p>
+    <w:p>
+      <w:r>
+        <w:rPr>
+          <w:rFonts w:ascii="Noto Serif CJK SC" w:hAnsi="Noto Serif CJK SC" w:eastAsia="Noto Serif CJK SC"/>
+          <w:color w:val="000000"/>
+          <w:sz w:val="21"/>
+        </w:rPr>
+        <w:t>本作品将自然语言交互接入实际教育服务流程。AI辅助整理需求与提出候选内容，确定性规则检查筛选条件、内容结构和证据引用；用户确认需求，教师核验教学成果。推荐、预约和教学发布各有明确入口与状态，不让一次对话直接替代关键业务决策。</w:t>
+      </w:r>
+    </w:p>
+    <w:p>
+      <w:r>
+        <w:rPr>
+          <w:rFonts w:ascii="Noto Serif CJK SC" w:hAnsi="Noto Serif CJK SC" w:eastAsia="Noto Serif CJK SC"/>
+          <w:color w:val="000000"/>
+          <w:sz w:val="21"/>
+        </w:rPr>
+        <w:t>这种分工使AI能力与软件工具相互衔接：语言表达转为可核对条件，条件进入可解释推荐，推荐进入预约，课堂事实再进入反馈与课程修订。AI应用的价值体现在可执行的服务步骤，以及每一步能够说明的依据。</w:t>
+      </w:r>
+    </w:p>
+    <w:p>
+      <w:pPr>
+        <w:pStyle w:val="Heading2"/>
+      </w:pPr>
+      <w:r>
+        <w:rPr>
+          <w:rFonts w:ascii="Noto Serif CJK SC" w:hAnsi="Noto Serif CJK SC" w:eastAsia="Noto Serif CJK SC"/>
+          <w:color w:val="000000"/>
+        </w:rPr>
+        <w:t>5.2 由课堂证据驱动反馈与课程修订</w:t>
+      </w:r>
+    </w:p>
+    <w:p>
+      <w:r>
+        <w:rPr>
+          <w:rFonts w:ascii="Noto Serif CJK SC" w:hAnsi="Noto Serif CJK SC" w:eastAsia="Noto Serif CJK SC"/>
+          <w:color w:val="000000"/>
+          <w:sz w:val="21"/>
+        </w:rPr>
+        <w:t>反馈围绕题目、课堂记录和教师观察展开；课程调整保留原版本、变更内容与确认结果。相比只输出通用学习建议，系统能够展示“引用了哪次课堂事实、针对哪类错误、改了哪个教学环节”，让建议具有可以回查的上下文。</w:t>
+      </w:r>
+    </w:p>
+    <w:p>
+      <w:pPr>
+        <w:pStyle w:val="Heading2"/>
+      </w:pPr>
+      <w:r>
+        <w:rPr>
+          <w:rFonts w:ascii="Noto Serif CJK SC" w:hAnsi="Noto Serif CJK SC" w:eastAsia="Noto Serif CJK SC"/>
+          <w:color w:val="000000"/>
+        </w:rPr>
+        <w:t>5.3 跨端共享与可替换服务架构</w:t>
       </w:r>
     </w:p>
     <w:tbl>
@@ -1703,7 +1761,17 @@
           <w:color w:val="000000"/>
           <w:sz w:val="21"/>
         </w:rPr>
-        <w:t>前端使用uni-app、Vue 3和TypeScript共享H5与微信小程序业务代码；开发后端使用Fastify、Prisma与SQLite。页面通过统一服务契约对接Mock或API，需求解析、问答、图片辅导、练习和教学建议通过服务端模型适配器接入，密钥不进入前端。</w:t>
+        <w:t>前端采用uni-app、Vue 3与TypeScript共享H5和微信小程序业务代码；开发后端使用Fastify、Prisma与SQLite。页面通过统一服务契约对接Mock或API，需求解析、问答、图片辅导、练习与教学建议通过服务端模型适配器接入，密钥不进入前端。</w:t>
+      </w:r>
+    </w:p>
+    <w:p>
+      <w:r>
+        <w:rPr>
+          <w:rFonts w:ascii="Noto Serif CJK SC" w:hAnsi="Noto Serif CJK SC" w:eastAsia="Noto Serif CJK SC"/>
+          <w:color w:val="000000"/>
+          <w:sz w:val="21"/>
+        </w:rPr>
+        <w:t>API检查身份、角色、预约归属与状态；家长不读取未发布草稿，发布版本留存，写入操作具有幂等和冲突处理机制。共享业务逻辑与可替换适配器支持小团队复用已有模块，减少不同终端重复实现相同流程。</w:t>
       </w:r>
     </w:p>
     <w:p>
@@ -1715,7 +1783,7 @@
           <w:rFonts w:ascii="Noto Serif CJK SC" w:hAnsi="Noto Serif CJK SC" w:eastAsia="Noto Serif CJK SC"/>
           <w:color w:val="000000"/>
         </w:rPr>
-        <w:t>5.2 受规则约束的人机协同流程</w:t>
+        <w:t>5.4 从创意到可运行原型的学生创业实践</w:t>
       </w:r>
     </w:p>
     <w:p>
@@ -1725,7 +1793,24 @@
           <w:color w:val="000000"/>
           <w:sz w:val="21"/>
         </w:rPr>
-        <w:t>模型辅助整理需求与提出候选内容，规则检查必要条件、内容结构和证据引用，用户确认需求，教师核验教学成果。API检查身份、角色、预约归属与状态，家长不读取未发布草稿；发布版本留存，写入操作具有幂等和冲突处理机制。</w:t>
+        <w:t>四人团队围绕家长、大学生家教和管理者拆分业务，以AI辅助编程、独立分支、接口协作和自动化验证推进开发。已交付的结果包括可运行页面、开发API、课程案例和演示路径，体现面向具体教育服务场景的小团队应用实践；不以基础模型训练或未验证的经营数据作为项目成果。</w:t>
+      </w:r>
+    </w:p>
+    <w:p>
+      <w:r>
+        <w:br w:type="page"/>
+      </w:r>
+    </w:p>
+    <w:p>
+      <w:pPr>
+        <w:pStyle w:val="Heading1"/>
+      </w:pPr>
+      <w:r>
+        <w:rPr>
+          <w:rFonts w:ascii="Noto Serif CJK SC" w:hAnsi="Noto Serif CJK SC" w:eastAsia="Noto Serif CJK SC"/>
+          <w:color w:val="000000"/>
+        </w:rPr>
+        <w:t>六 应用成效与可核查成果</w:t>
       </w:r>
     </w:p>
     <w:p>
@@ -1737,7 +1822,7 @@
           <w:rFonts w:ascii="Noto Serif CJK SC" w:hAnsi="Noto Serif CJK SC" w:eastAsia="Noto Serif CJK SC"/>
           <w:color w:val="000000"/>
         </w:rPr>
-        <w:t>5.3 小团队创业应用的实现特点</w:t>
+        <w:t>6.1 已形成的软件与内容成果</w:t>
       </w:r>
     </w:p>
     <w:tbl>
@@ -1748,8 +1833,9 @@
         <w:tblLook w:firstColumn="1" w:firstRow="1" w:lastColumn="0" w:lastRow="0" w:noHBand="0" w:noVBand="1" w:val="04A0"/>
       </w:tblPr>
       <w:tblGrid>
-        <w:gridCol w:w="2835"/>
-        <w:gridCol w:w="6690"/>
+        <w:gridCol w:w="3175"/>
+        <w:gridCol w:w="3175"/>
+        <w:gridCol w:w="3175"/>
       </w:tblGrid>
       <w:tr>
         <w:trPr>
@@ -1758,7 +1844,7 @@
         </w:trPr>
         <w:tc>
           <w:tcPr>
-            <w:tcW w:type="dxa" w:w="2835"/>
+            <w:tcW w:type="dxa" w:w="3175"/>
             <w:shd w:fill="F2F2F2"/>
             <w:vAlign w:val="center"/>
           </w:tcPr>
@@ -1773,13 +1859,13 @@
                 <w:color w:val="000000"/>
                 <w:sz w:val="20"/>
               </w:rPr>
-              <w:t>实现特点</w:t>
+              <w:t>已形成成果</w:t>
             </w:r>
           </w:p>
         </w:tc>
         <w:tc>
           <w:tcPr>
-            <w:tcW w:type="dxa" w:w="6690"/>
+            <w:tcW w:type="dxa" w:w="3175"/>
             <w:shd w:fill="F2F2F2"/>
             <w:vAlign w:val="center"/>
           </w:tcPr>
@@ -1794,7 +1880,28 @@
                 <w:color w:val="000000"/>
                 <w:sz w:val="20"/>
               </w:rPr>
-              <w:t>本项目中的具体体现</w:t>
+              <w:t>实际内容</w:t>
+            </w:r>
+          </w:p>
+        </w:tc>
+        <w:tc>
+          <w:tcPr>
+            <w:tcW w:type="dxa" w:w="3175"/>
+            <w:shd w:fill="F2F2F2"/>
+            <w:vAlign w:val="center"/>
+          </w:tcPr>
+          <w:p>
+            <w:pPr>
+              <w:spacing w:after="80" w:line="276" w:lineRule="auto"/>
+            </w:pPr>
+            <w:r>
+              <w:rPr>
+                <w:rFonts w:ascii="Noto Serif CJK SC" w:hAnsi="Noto Serif CJK SC" w:eastAsia="Noto Serif CJK SC"/>
+                <w:b/>
+                <w:color w:val="000000"/>
+                <w:sz w:val="20"/>
+              </w:rPr>
+              <w:t>可展示的结果</w:t>
             </w:r>
           </w:p>
         </w:tc>
@@ -1805,7 +1912,7 @@
         </w:trPr>
         <w:tc>
           <w:tcPr>
-            <w:tcW w:type="dxa" w:w="2835"/>
+            <w:tcW w:type="dxa" w:w="3175"/>
             <w:vAlign w:val="center"/>
           </w:tcPr>
           <w:p>
@@ -1819,13 +1926,13 @@
                 <w:color w:val="000000"/>
                 <w:sz w:val="20"/>
               </w:rPr>
-              <w:t>服务链连续</w:t>
+              <w:t>教师目录与透明匹配</w:t>
             </w:r>
           </w:p>
         </w:tc>
         <w:tc>
           <w:tcPr>
-            <w:tcW w:type="dxa" w:w="6690"/>
+            <w:tcW w:type="dxa" w:w="3175"/>
             <w:vAlign w:val="center"/>
           </w:tcPr>
           <w:p>
@@ -1839,18 +1946,13 @@
                 <w:color w:val="000000"/>
                 <w:sz w:val="20"/>
               </w:rPr>
-              <w:t>学习助手连接需求、匹配、预约、课堂记录与反馈</w:t>
+              <w:t>24份合成资料、五维评分与条件筛选</w:t>
             </w:r>
           </w:p>
         </w:tc>
-      </w:tr>
-      <w:tr>
-        <w:trPr>
-          <w:cantSplit/>
-        </w:trPr>
         <w:tc>
           <w:tcPr>
-            <w:tcW w:type="dxa" w:w="2835"/>
+            <w:tcW w:type="dxa" w:w="3175"/>
             <w:vAlign w:val="center"/>
           </w:tcPr>
           <w:p>
@@ -1864,13 +1966,18 @@
                 <w:color w:val="000000"/>
                 <w:sz w:val="20"/>
               </w:rPr>
-              <w:t>结果可解释</w:t>
+              <w:t>教师卡片、排除条件、分项理由和详情</w:t>
             </w:r>
           </w:p>
         </w:tc>
+      </w:tr>
+      <w:tr>
+        <w:trPr>
+          <w:cantSplit/>
+        </w:trPr>
         <w:tc>
           <w:tcPr>
-            <w:tcW w:type="dxa" w:w="6690"/>
+            <w:tcW w:type="dxa" w:w="3175"/>
             <w:vAlign w:val="center"/>
           </w:tcPr>
           <w:p>
@@ -1884,18 +1991,13 @@
                 <w:color w:val="000000"/>
                 <w:sz w:val="20"/>
               </w:rPr>
-              <w:t>展示筛选条件、分项得分及教学反馈证据</w:t>
+              <w:t>三角色服务流程</w:t>
             </w:r>
           </w:p>
         </w:tc>
-      </w:tr>
-      <w:tr>
-        <w:trPr>
-          <w:cantSplit/>
-        </w:trPr>
         <w:tc>
           <w:tcPr>
-            <w:tcW w:type="dxa" w:w="2835"/>
+            <w:tcW w:type="dxa" w:w="3175"/>
             <w:vAlign w:val="center"/>
           </w:tcPr>
           <w:p>
@@ -1909,13 +2011,13 @@
                 <w:color w:val="000000"/>
                 <w:sz w:val="20"/>
               </w:rPr>
-              <w:t>人工保留决定权</w:t>
+              <w:t>家长预约、家教接单、管理员审核</w:t>
             </w:r>
           </w:p>
         </w:tc>
         <w:tc>
           <w:tcPr>
-            <w:tcW w:type="dxa" w:w="6690"/>
+            <w:tcW w:type="dxa" w:w="3175"/>
             <w:vAlign w:val="center"/>
           </w:tcPr>
           <w:p>
@@ -1929,7 +2031,7 @@
                 <w:color w:val="000000"/>
                 <w:sz w:val="20"/>
               </w:rPr>
-              <w:t>用户决定选师，教师确认课程、反馈和修订</w:t>
+              <w:t>归属明确的预约状态与操作入口</w:t>
             </w:r>
           </w:p>
         </w:tc>
@@ -1940,7 +2042,7 @@
         </w:trPr>
         <w:tc>
           <w:tcPr>
-            <w:tcW w:type="dxa" w:w="2835"/>
+            <w:tcW w:type="dxa" w:w="3175"/>
             <w:vAlign w:val="center"/>
           </w:tcPr>
           <w:p>
@@ -1954,13 +2056,13 @@
                 <w:color w:val="000000"/>
                 <w:sz w:val="20"/>
               </w:rPr>
-              <w:t>小团队快速迭代</w:t>
+              <w:t>学习资源与助手</w:t>
             </w:r>
           </w:p>
         </w:tc>
         <w:tc>
           <w:tcPr>
-            <w:tcW w:type="dxa" w:w="6690"/>
+            <w:tcW w:type="dxa" w:w="3175"/>
             <w:vAlign w:val="center"/>
           </w:tcPr>
           <w:p>
@@ -1974,18 +2076,13 @@
                 <w:color w:val="000000"/>
                 <w:sz w:val="20"/>
               </w:rPr>
-              <w:t>共享跨端代码、模块化服务和独立分支协作</w:t>
+              <w:t>22份原创笔记、66道固定题及问答入口</w:t>
             </w:r>
           </w:p>
         </w:tc>
-      </w:tr>
-      <w:tr>
-        <w:trPr>
-          <w:cantSplit/>
-        </w:trPr>
         <w:tc>
           <w:tcPr>
-            <w:tcW w:type="dxa" w:w="2835"/>
+            <w:tcW w:type="dxa" w:w="3175"/>
             <w:vAlign w:val="center"/>
           </w:tcPr>
           <w:p>
@@ -1999,13 +2096,18 @@
                 <w:color w:val="000000"/>
                 <w:sz w:val="20"/>
               </w:rPr>
-              <w:t>交付可复现</w:t>
+              <w:t>知识浏览、自测、答案解析和工具衔接</w:t>
             </w:r>
           </w:p>
         </w:tc>
+      </w:tr>
+      <w:tr>
+        <w:trPr>
+          <w:cantSplit/>
+        </w:trPr>
         <w:tc>
           <w:tcPr>
-            <w:tcW w:type="dxa" w:w="6690"/>
+            <w:tcW w:type="dxa" w:w="3175"/>
             <w:vAlign w:val="center"/>
           </w:tcPr>
           <w:p>
@@ -2019,7 +2121,177 @@
                 <w:color w:val="000000"/>
                 <w:sz w:val="20"/>
               </w:rPr>
-              <w:t>启动命令、虚构教学案例、测试与版本记录齐备</w:t>
+              <w:t>西安片区与订单地图</w:t>
+            </w:r>
+          </w:p>
+        </w:tc>
+        <w:tc>
+          <w:tcPr>
+            <w:tcW w:type="dxa" w:w="3175"/>
+            <w:vAlign w:val="center"/>
+          </w:tcPr>
+          <w:p>
+            <w:pPr>
+              <w:spacing w:after="80" w:line="276" w:lineRule="auto"/>
+            </w:pPr>
+            <w:r>
+              <w:rPr>
+                <w:rFonts w:ascii="Noto Serif CJK SC" w:hAnsi="Noto Serif CJK SC" w:eastAsia="Noto Serif CJK SC"/>
+                <w:b w:val="0"/>
+                <w:color w:val="000000"/>
+                <w:sz w:val="20"/>
+              </w:rPr>
+              <w:t>公共片区、账户订单与12条虚构样例</w:t>
+            </w:r>
+          </w:p>
+        </w:tc>
+        <w:tc>
+          <w:tcPr>
+            <w:tcW w:type="dxa" w:w="3175"/>
+            <w:vAlign w:val="center"/>
+          </w:tcPr>
+          <w:p>
+            <w:pPr>
+              <w:spacing w:after="80" w:line="276" w:lineRule="auto"/>
+            </w:pPr>
+            <w:r>
+              <w:rPr>
+                <w:rFonts w:ascii="Noto Serif CJK SC" w:hAnsi="Noto Serif CJK SC" w:eastAsia="Noto Serif CJK SC"/>
+                <w:b w:val="0"/>
+                <w:color w:val="000000"/>
+                <w:sz w:val="20"/>
+              </w:rPr>
+              <w:t>地图片区、权限内状态和参考距离</w:t>
+            </w:r>
+          </w:p>
+        </w:tc>
+      </w:tr>
+      <w:tr>
+        <w:trPr>
+          <w:cantSplit/>
+        </w:trPr>
+        <w:tc>
+          <w:tcPr>
+            <w:tcW w:type="dxa" w:w="3175"/>
+            <w:vAlign w:val="center"/>
+          </w:tcPr>
+          <w:p>
+            <w:pPr>
+              <w:spacing w:after="80" w:line="276" w:lineRule="auto"/>
+            </w:pPr>
+            <w:r>
+              <w:rPr>
+                <w:rFonts w:ascii="Noto Serif CJK SC" w:hAnsi="Noto Serif CJK SC" w:eastAsia="Noto Serif CJK SC"/>
+                <w:b w:val="0"/>
+                <w:color w:val="000000"/>
+                <w:sz w:val="20"/>
+              </w:rPr>
+              <w:t>四课教学与版本</w:t>
+            </w:r>
+          </w:p>
+        </w:tc>
+        <w:tc>
+          <w:tcPr>
+            <w:tcW w:type="dxa" w:w="3175"/>
+            <w:vAlign w:val="center"/>
+          </w:tcPr>
+          <w:p>
+            <w:pPr>
+              <w:spacing w:after="80" w:line="276" w:lineRule="auto"/>
+            </w:pPr>
+            <w:r>
+              <w:rPr>
+                <w:rFonts w:ascii="Noto Serif CJK SC" w:hAnsi="Noto Serif CJK SC" w:eastAsia="Noto Serif CJK SC"/>
+                <w:b w:val="0"/>
+                <w:color w:val="000000"/>
+                <w:sz w:val="20"/>
+              </w:rPr>
+              <w:t>四节45分钟课程、逐题记录与反馈</w:t>
+            </w:r>
+          </w:p>
+        </w:tc>
+        <w:tc>
+          <w:tcPr>
+            <w:tcW w:type="dxa" w:w="3175"/>
+            <w:vAlign w:val="center"/>
+          </w:tcPr>
+          <w:p>
+            <w:pPr>
+              <w:spacing w:after="80" w:line="276" w:lineRule="auto"/>
+            </w:pPr>
+            <w:r>
+              <w:rPr>
+                <w:rFonts w:ascii="Noto Serif CJK SC" w:hAnsi="Noto Serif CJK SC" w:eastAsia="Noto Serif CJK SC"/>
+                <w:b w:val="0"/>
+                <w:color w:val="000000"/>
+                <w:sz w:val="20"/>
+              </w:rPr>
+              <w:t>教师确认、v1／v2对照和家长只读</w:t>
+            </w:r>
+          </w:p>
+        </w:tc>
+      </w:tr>
+      <w:tr>
+        <w:trPr>
+          <w:cantSplit/>
+        </w:trPr>
+        <w:tc>
+          <w:tcPr>
+            <w:tcW w:type="dxa" w:w="3175"/>
+            <w:vAlign w:val="center"/>
+          </w:tcPr>
+          <w:p>
+            <w:pPr>
+              <w:spacing w:after="80" w:line="276" w:lineRule="auto"/>
+            </w:pPr>
+            <w:r>
+              <w:rPr>
+                <w:rFonts w:ascii="Noto Serif CJK SC" w:hAnsi="Noto Serif CJK SC" w:eastAsia="Noto Serif CJK SC"/>
+                <w:b w:val="0"/>
+                <w:color w:val="000000"/>
+                <w:sz w:val="20"/>
+              </w:rPr>
+              <w:t>跨端与开发运行</w:t>
+            </w:r>
+          </w:p>
+        </w:tc>
+        <w:tc>
+          <w:tcPr>
+            <w:tcW w:type="dxa" w:w="3175"/>
+            <w:vAlign w:val="center"/>
+          </w:tcPr>
+          <w:p>
+            <w:pPr>
+              <w:spacing w:after="80" w:line="276" w:lineRule="auto"/>
+            </w:pPr>
+            <w:r>
+              <w:rPr>
+                <w:rFonts w:ascii="Noto Serif CJK SC" w:hAnsi="Noto Serif CJK SC" w:eastAsia="Noto Serif CJK SC"/>
+                <w:b w:val="0"/>
+                <w:color w:val="000000"/>
+                <w:sz w:val="20"/>
+              </w:rPr>
+              <w:t>H5／小程序共享代码、Mock／API双模式</w:t>
+            </w:r>
+          </w:p>
+        </w:tc>
+        <w:tc>
+          <w:tcPr>
+            <w:tcW w:type="dxa" w:w="3175"/>
+            <w:vAlign w:val="center"/>
+          </w:tcPr>
+          <w:p>
+            <w:pPr>
+              <w:spacing w:after="80" w:line="276" w:lineRule="auto"/>
+            </w:pPr>
+            <w:r>
+              <w:rPr>
+                <w:rFonts w:ascii="Noto Serif CJK SC" w:hAnsi="Noto Serif CJK SC" w:eastAsia="Noto Serif CJK SC"/>
+                <w:b w:val="0"/>
+                <w:color w:val="000000"/>
+                <w:sz w:val="20"/>
+              </w:rPr>
+              <w:t>浏览器演示、双端构建和开发数据持久化</w:t>
             </w:r>
           </w:p>
         </w:tc>
@@ -2034,7 +2306,7 @@
           <w:rFonts w:ascii="Noto Serif CJK SC" w:hAnsi="Noto Serif CJK SC" w:eastAsia="Noto Serif CJK SC"/>
           <w:color w:val="000000"/>
         </w:rPr>
-        <w:t>5.4 可核查的工程验证</w:t>
+        <w:t>6.2 让不同角色看见具体服务结果</w:t>
       </w:r>
     </w:p>
     <w:p>
@@ -2044,7 +2316,39 @@
           <w:color w:val="000000"/>
           <w:sz w:val="21"/>
         </w:rPr>
-        <w:t>main基线5d04c4f的GitHub Actions中build、server、e2e三项作业均成功，覆盖类型检查、前后端测试、双端构建和浏览器业务流程。工程验收证明该版本软件流程可复现，不代替真实学习效果或商业经营数据。</w:t>
+        <w:t>对家长，平台把需求、推荐理由、教师资料、预约状态与已发布反馈集中呈现，便于判断和持续了解教学进展。对大学生家教，平台把接单、备课、逐题记录和下一课修订连接起来，使教学安排具有可回看的依据。对学生，学习内容、自测解析与找老师入口相互衔接；对管理者，入驻资料审核、举报处理和权限内状态形成管理入口。</w:t>
+      </w:r>
+    </w:p>
+    <w:p>
+      <w:r>
+        <w:rPr>
+          <w:rFonts w:ascii="Noto Serif CJK SC" w:hAnsi="Noto Serif CJK SC" w:eastAsia="Noto Serif CJK SC"/>
+          <w:color w:val="000000"/>
+          <w:sz w:val="21"/>
+        </w:rPr>
+        <w:t>这些是可以通过页面和状态变化观察的功能成果。合成资料与固定题目数量表示演示内容规模，不能作为实际用户量；课堂案例用于证明流程，不作为真实提分数据。</w:t>
+      </w:r>
+    </w:p>
+    <w:p>
+      <w:pPr>
+        <w:pStyle w:val="Heading2"/>
+      </w:pPr>
+      <w:r>
+        <w:rPr>
+          <w:rFonts w:ascii="Noto Serif CJK SC" w:hAnsi="Noto Serif CJK SC" w:eastAsia="Noto Serif CJK SC"/>
+          <w:color w:val="000000"/>
+        </w:rPr>
+        <w:t>6.3 工程证据与复现入口</w:t>
+      </w:r>
+    </w:p>
+    <w:p>
+      <w:r>
+        <w:rPr>
+          <w:rFonts w:ascii="Noto Serif CJK SC" w:hAnsi="Noto Serif CJK SC" w:eastAsia="Noto Serif CJK SC"/>
+          <w:color w:val="000000"/>
+          <w:sz w:val="21"/>
+        </w:rPr>
+        <w:t>main基线5d04c4f的GitHub Actions中build、server、e2e均成功，验证类型检查、前后端测试、双端构建与浏览器流程。独立浏览器可按仓库指南复现匹配、约课、课程发布、课堂记录与反馈修订。</w:t>
       </w:r>
     </w:p>
     <w:p>
@@ -2076,7 +2380,7 @@
           <w:color w:val="000000"/>
           <w:sz w:val="21"/>
         </w:rPr>
-        <w:t>实现与核查基线：5d04c4f；核查日期：2026年10月24日。</w:t>
+        <w:t>材料日期：2026年10月24日；实现与核查基线：5d04c4f。</w:t>
       </w:r>
     </w:p>
     <w:sectPr>

</xml_diff>